<commit_message>
Give the Minors line 2pt of room under the B.S. line
In both résumé sources (assets/ master and wayfinder/). The master also
gains a document title, so its rebuilt PDF is titled like the Wayfinder one.
On the Wayfinder copy the 2pt comes back out of the skills rows to stay on
one page.

Co-Authored-By: Claude Opus 5.5 <noreply@anthropic.com>
Claude-Session: https://claude.ai/code/session_013tTYg5CnfyPjY41cDotbqv
</commit_message>
<xml_diff>
--- a/wayfinder/resume.docx
+++ b/wayfinder/resume.docx
@@ -781,7 +781,7 @@
     </w:p>
     <w:p>
       <w:pPr>
-        <w:spacing w:after="200" w:before="0" w:line="240" w:lineRule="auto"/>
+        <w:spacing w:after="200" w:before="40" w:line="240" w:lineRule="auto"/>
         <w:rPr/>
       </w:pPr>
       <w:r>
@@ -841,7 +841,7 @@
     </w:p>
     <w:p>
       <w:pPr>
-        <w:spacing w:before="100" w:line="240" w:lineRule="auto"/>
+        <w:spacing w:before="90" w:line="240" w:lineRule="auto"/>
         <w:rPr>
           <w:rFonts w:ascii="Arial" w:cs="Arial" w:eastAsia="Arial" w:hAnsi="Arial"/>
           <w:sz w:val="22"/>
@@ -871,7 +871,7 @@
     </w:p>
     <w:p>
       <w:pPr>
-        <w:spacing w:before="100" w:line="240" w:lineRule="auto"/>
+        <w:spacing w:before="90" w:line="240" w:lineRule="auto"/>
         <w:rPr>
           <w:rFonts w:ascii="Arial" w:cs="Arial" w:eastAsia="Arial" w:hAnsi="Arial"/>
           <w:sz w:val="22"/>
@@ -901,7 +901,7 @@
     </w:p>
     <w:p>
       <w:pPr>
-        <w:spacing w:before="100" w:line="240" w:lineRule="auto"/>
+        <w:spacing w:before="90" w:line="240" w:lineRule="auto"/>
         <w:rPr>
           <w:rFonts w:ascii="Arial" w:cs="Arial" w:eastAsia="Arial" w:hAnsi="Arial"/>
           <w:sz w:val="22"/>
@@ -931,7 +931,7 @@
     </w:p>
     <w:p>
       <w:pPr>
-        <w:spacing w:before="100" w:line="240" w:lineRule="auto"/>
+        <w:spacing w:before="90" w:line="240" w:lineRule="auto"/>
         <w:rPr>
           <w:rFonts w:ascii="Arial" w:cs="Arial" w:eastAsia="Arial" w:hAnsi="Arial"/>
           <w:sz w:val="22"/>
@@ -961,7 +961,7 @@
     </w:p>
     <w:p>
       <w:pPr>
-        <w:spacing w:before="100" w:line="240" w:lineRule="auto"/>
+        <w:spacing w:before="90" w:line="240" w:lineRule="auto"/>
         <w:rPr>
           <w:rFonts w:ascii="Arial" w:cs="Arial" w:eastAsia="Arial" w:hAnsi="Arial"/>
           <w:sz w:val="22"/>
@@ -991,7 +991,7 @@
     </w:p>
     <w:p>
       <w:pPr>
-        <w:spacing w:before="100" w:line="240" w:lineRule="auto"/>
+        <w:spacing w:before="90" w:line="240" w:lineRule="auto"/>
         <w:rPr>
           <w:rFonts w:ascii="Arial" w:cs="Arial" w:eastAsia="Arial" w:hAnsi="Arial"/>
           <w:sz w:val="22"/>
@@ -1021,7 +1021,7 @@
     </w:p>
     <w:p>
       <w:pPr>
-        <w:spacing w:before="100" w:line="240" w:lineRule="auto"/>
+        <w:spacing w:before="90" w:line="240" w:lineRule="auto"/>
         <w:rPr>
           <w:rFonts w:ascii="Arial" w:cs="Arial" w:eastAsia="Arial" w:hAnsi="Arial"/>
           <w:sz w:val="22"/>

</xml_diff>